<commit_message>
docs: update UAS reports
</commit_message>
<xml_diff>
--- a/docs/Laporan_Fuzzy_Mamdani.docx
+++ b/docs/Laporan_Fuzzy_Mamdani.docx
@@ -243,7 +243,7 @@
           </mc:Choice>
           <mc:Fallback>
             <w:pict>
-              <v:group w14:anchorId="6122940E" id="Group 10" o:spid="_x0000_s1026" style="position:absolute;margin-left:0;margin-top:12.25pt;width:51.1pt;height:226.7pt;z-index:251657728;mso-position-horizontal:center;mso-position-horizontal-relative:margin" coordorigin="6005,6907" coordsize="1022,4534" o:gfxdata="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">
+              <v:group w14:anchorId="7A2A223F" id="Group 10" o:spid="_x0000_s1026" style="position:absolute;margin-left:0;margin-top:12.25pt;width:51.1pt;height:226.7pt;z-index:251657728;mso-position-horizontal:center;mso-position-horizontal-relative:margin" coordorigin="6005,6907" coordsize="1022,4534" o:gfxdata="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">
                 <v:line id="Straight Connector 4" o:spid="_x0000_s1027" style="position:absolute;visibility:visible;mso-wrap-style:square" from="6005,7181" to="6005,11433" o:connectortype="straight" o:gfxdata="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" strokecolor="#00b0f0" strokeweight="7pt">
                   <v:stroke joinstyle="miter"/>
                 </v:line>
@@ -2467,6 +2467,8 @@
               <m:ctrlPr>
                 <w:rPr>
                   <w:rFonts w:ascii="Cambria Math" w:hAnsi="Cambria Math"/>
+                  <w:sz w:val="32"/>
+                  <w:szCs w:val="32"/>
                 </w:rPr>
               </m:ctrlPr>
             </m:sSubPr>
@@ -2474,6 +2476,8 @@
               <m:r>
                 <w:rPr>
                   <w:rFonts w:ascii="Cambria Math" w:hAnsi="Cambria Math"/>
+                  <w:sz w:val="32"/>
+                  <w:szCs w:val="32"/>
                 </w:rPr>
                 <m:t>α</m:t>
               </m:r>
@@ -2482,6 +2486,8 @@
               <m:r>
                 <w:rPr>
                   <w:rFonts w:ascii="Cambria Math" w:hAnsi="Cambria Math"/>
+                  <w:sz w:val="32"/>
+                  <w:szCs w:val="32"/>
                 </w:rPr>
                 <m:t>i</m:t>
               </m:r>
@@ -2490,6 +2496,8 @@
           <m:r>
             <w:rPr>
               <w:rFonts w:ascii="Cambria Math" w:hAnsi="Cambria Math"/>
+              <w:sz w:val="32"/>
+              <w:szCs w:val="32"/>
             </w:rPr>
             <m:t>=</m:t>
           </m:r>
@@ -2498,6 +2506,8 @@
               <m:ctrlPr>
                 <w:rPr>
                   <w:rFonts w:ascii="Cambria Math" w:hAnsi="Cambria Math"/>
+                  <w:sz w:val="32"/>
+                  <w:szCs w:val="32"/>
                 </w:rPr>
               </m:ctrlPr>
             </m:funcPr>
@@ -2508,6 +2518,8 @@
                 </m:rPr>
                 <w:rPr>
                   <w:rFonts w:ascii="Cambria Math" w:hAnsi="Cambria Math"/>
+                  <w:sz w:val="32"/>
+                  <w:szCs w:val="32"/>
                 </w:rPr>
                 <m:t>min</m:t>
               </m:r>
@@ -2518,6 +2530,8 @@
                   <m:ctrlPr>
                     <w:rPr>
                       <w:rFonts w:ascii="Cambria Math" w:hAnsi="Cambria Math"/>
+                      <w:sz w:val="32"/>
+                      <w:szCs w:val="32"/>
                     </w:rPr>
                   </m:ctrlPr>
                 </m:dPr>
@@ -2527,6 +2541,8 @@
                       <m:ctrlPr>
                         <w:rPr>
                           <w:rFonts w:ascii="Cambria Math" w:hAnsi="Cambria Math"/>
+                          <w:sz w:val="32"/>
+                          <w:szCs w:val="32"/>
                         </w:rPr>
                       </m:ctrlPr>
                     </m:sSubPr>
@@ -2534,6 +2550,8 @@
                       <m:r>
                         <w:rPr>
                           <w:rFonts w:ascii="Cambria Math" w:hAnsi="Cambria Math"/>
+                          <w:sz w:val="32"/>
+                          <w:szCs w:val="32"/>
                         </w:rPr>
                         <m:t>μ</m:t>
                       </m:r>
@@ -2542,6 +2560,8 @@
                       <m:r>
                         <w:rPr>
                           <w:rFonts w:ascii="Cambria Math" w:hAnsi="Cambria Math"/>
+                          <w:sz w:val="32"/>
+                          <w:szCs w:val="32"/>
                         </w:rPr>
                         <m:t>A</m:t>
                       </m:r>
@@ -2552,6 +2572,8 @@
                       <m:ctrlPr>
                         <w:rPr>
                           <w:rFonts w:ascii="Cambria Math" w:hAnsi="Cambria Math"/>
+                          <w:sz w:val="32"/>
+                          <w:szCs w:val="32"/>
                         </w:rPr>
                       </m:ctrlPr>
                     </m:dPr>
@@ -2559,6 +2581,8 @@
                       <m:r>
                         <w:rPr>
                           <w:rFonts w:ascii="Cambria Math" w:hAnsi="Cambria Math"/>
+                          <w:sz w:val="32"/>
+                          <w:szCs w:val="32"/>
                         </w:rPr>
                         <m:t>x</m:t>
                       </m:r>
@@ -2567,6 +2591,8 @@
                   <m:r>
                     <w:rPr>
                       <w:rFonts w:ascii="Cambria Math" w:hAnsi="Cambria Math"/>
+                      <w:sz w:val="32"/>
+                      <w:szCs w:val="32"/>
                     </w:rPr>
                     <m:t>,</m:t>
                   </m:r>
@@ -2575,6 +2601,8 @@
                       <m:ctrlPr>
                         <w:rPr>
                           <w:rFonts w:ascii="Cambria Math" w:hAnsi="Cambria Math"/>
+                          <w:sz w:val="32"/>
+                          <w:szCs w:val="32"/>
                         </w:rPr>
                       </m:ctrlPr>
                     </m:sSubPr>
@@ -2582,6 +2610,8 @@
                       <m:r>
                         <w:rPr>
                           <w:rFonts w:ascii="Cambria Math" w:hAnsi="Cambria Math"/>
+                          <w:sz w:val="32"/>
+                          <w:szCs w:val="32"/>
                         </w:rPr>
                         <m:t>μ</m:t>
                       </m:r>
@@ -2590,6 +2620,8 @@
                       <m:r>
                         <w:rPr>
                           <w:rFonts w:ascii="Cambria Math" w:hAnsi="Cambria Math"/>
+                          <w:sz w:val="32"/>
+                          <w:szCs w:val="32"/>
                         </w:rPr>
                         <m:t>B</m:t>
                       </m:r>
@@ -2600,6 +2632,8 @@
                       <m:ctrlPr>
                         <w:rPr>
                           <w:rFonts w:ascii="Cambria Math" w:hAnsi="Cambria Math"/>
+                          <w:sz w:val="32"/>
+                          <w:szCs w:val="32"/>
                         </w:rPr>
                       </m:ctrlPr>
                     </m:dPr>
@@ -2607,6 +2641,8 @@
                       <m:r>
                         <w:rPr>
                           <w:rFonts w:ascii="Cambria Math" w:hAnsi="Cambria Math"/>
+                          <w:sz w:val="32"/>
+                          <w:szCs w:val="32"/>
                         </w:rPr>
                         <m:t>y</m:t>
                       </m:r>
@@ -2615,6 +2651,8 @@
                   <m:r>
                     <w:rPr>
                       <w:rFonts w:ascii="Cambria Math" w:hAnsi="Cambria Math"/>
+                      <w:sz w:val="32"/>
+                      <w:szCs w:val="32"/>
                     </w:rPr>
                     <m:t>,</m:t>
                   </m:r>
@@ -2623,6 +2661,8 @@
                       <m:ctrlPr>
                         <w:rPr>
                           <w:rFonts w:ascii="Cambria Math" w:hAnsi="Cambria Math"/>
+                          <w:sz w:val="32"/>
+                          <w:szCs w:val="32"/>
                         </w:rPr>
                       </m:ctrlPr>
                     </m:sSubPr>
@@ -2630,6 +2670,8 @@
                       <m:r>
                         <w:rPr>
                           <w:rFonts w:ascii="Cambria Math" w:hAnsi="Cambria Math"/>
+                          <w:sz w:val="32"/>
+                          <w:szCs w:val="32"/>
                         </w:rPr>
                         <m:t>μ</m:t>
                       </m:r>
@@ -2638,6 +2680,8 @@
                       <m:r>
                         <w:rPr>
                           <w:rFonts w:ascii="Cambria Math" w:hAnsi="Cambria Math"/>
+                          <w:sz w:val="32"/>
+                          <w:szCs w:val="32"/>
                         </w:rPr>
                         <m:t>C</m:t>
                       </m:r>
@@ -2648,6 +2692,8 @@
                       <m:ctrlPr>
                         <w:rPr>
                           <w:rFonts w:ascii="Cambria Math" w:hAnsi="Cambria Math"/>
+                          <w:sz w:val="32"/>
+                          <w:szCs w:val="32"/>
                         </w:rPr>
                       </m:ctrlPr>
                     </m:dPr>
@@ -2655,6 +2701,8 @@
                       <m:r>
                         <w:rPr>
                           <w:rFonts w:ascii="Cambria Math" w:hAnsi="Cambria Math"/>
+                          <w:sz w:val="32"/>
+                          <w:szCs w:val="32"/>
                         </w:rPr>
                         <m:t>z</m:t>
                       </m:r>
@@ -2663,6 +2711,8 @@
                   <m:r>
                     <w:rPr>
                       <w:rFonts w:ascii="Cambria Math" w:hAnsi="Cambria Math"/>
+                      <w:sz w:val="32"/>
+                      <w:szCs w:val="32"/>
                     </w:rPr>
                     <m:t>)</m:t>
                   </m:r>
@@ -2685,6 +2735,8 @@
               <m:ctrlPr>
                 <w:rPr>
                   <w:rFonts w:ascii="Cambria Math" w:hAnsi="Cambria Math"/>
+                  <w:sz w:val="32"/>
+                  <w:szCs w:val="32"/>
                 </w:rPr>
               </m:ctrlPr>
             </m:sSubPr>
@@ -2692,6 +2744,8 @@
               <m:r>
                 <w:rPr>
                   <w:rFonts w:ascii="Cambria Math" w:hAnsi="Cambria Math"/>
+                  <w:sz w:val="32"/>
+                  <w:szCs w:val="32"/>
                 </w:rPr>
                 <m:t>μ</m:t>
               </m:r>
@@ -2700,6 +2754,8 @@
               <m:r>
                 <w:rPr>
                   <w:rFonts w:ascii="Cambria Math" w:hAnsi="Cambria Math"/>
+                  <w:sz w:val="32"/>
+                  <w:szCs w:val="32"/>
                 </w:rPr>
                 <m:t>output</m:t>
               </m:r>
@@ -2710,6 +2766,8 @@
               <m:ctrlPr>
                 <w:rPr>
                   <w:rFonts w:ascii="Cambria Math" w:hAnsi="Cambria Math"/>
+                  <w:sz w:val="32"/>
+                  <w:szCs w:val="32"/>
                 </w:rPr>
               </m:ctrlPr>
             </m:dPr>
@@ -2717,6 +2775,8 @@
               <m:r>
                 <w:rPr>
                   <w:rFonts w:ascii="Cambria Math" w:hAnsi="Cambria Math"/>
+                  <w:sz w:val="32"/>
+                  <w:szCs w:val="32"/>
                 </w:rPr>
                 <m:t>t</m:t>
               </m:r>
@@ -2725,6 +2785,8 @@
           <m:r>
             <w:rPr>
               <w:rFonts w:ascii="Cambria Math" w:hAnsi="Cambria Math"/>
+              <w:sz w:val="32"/>
+              <w:szCs w:val="32"/>
             </w:rPr>
             <m:t>=</m:t>
           </m:r>
@@ -2733,6 +2795,8 @@
               <m:ctrlPr>
                 <w:rPr>
                   <w:rFonts w:ascii="Cambria Math" w:hAnsi="Cambria Math"/>
+                  <w:sz w:val="32"/>
+                  <w:szCs w:val="32"/>
                 </w:rPr>
               </m:ctrlPr>
             </m:funcPr>
@@ -2743,6 +2807,8 @@
                 </m:rPr>
                 <w:rPr>
                   <w:rFonts w:ascii="Cambria Math" w:hAnsi="Cambria Math"/>
+                  <w:sz w:val="32"/>
+                  <w:szCs w:val="32"/>
                 </w:rPr>
                 <m:t>max</m:t>
               </m:r>
@@ -2753,6 +2819,8 @@
                   <m:ctrlPr>
                     <w:rPr>
                       <w:rFonts w:ascii="Cambria Math" w:hAnsi="Cambria Math"/>
+                      <w:sz w:val="32"/>
+                      <w:szCs w:val="32"/>
                     </w:rPr>
                   </m:ctrlPr>
                 </m:dPr>
@@ -2762,6 +2830,8 @@
                       <m:ctrlPr>
                         <w:rPr>
                           <w:rFonts w:ascii="Cambria Math" w:hAnsi="Cambria Math"/>
+                          <w:sz w:val="32"/>
+                          <w:szCs w:val="32"/>
                         </w:rPr>
                       </m:ctrlPr>
                     </m:sSubPr>
@@ -2769,6 +2839,8 @@
                       <m:r>
                         <w:rPr>
                           <w:rFonts w:ascii="Cambria Math" w:hAnsi="Cambria Math"/>
+                          <w:sz w:val="32"/>
+                          <w:szCs w:val="32"/>
                         </w:rPr>
                         <m:t>μ</m:t>
                       </m:r>
@@ -2777,6 +2849,8 @@
                       <m:r>
                         <w:rPr>
                           <w:rFonts w:ascii="Cambria Math" w:hAnsi="Cambria Math"/>
+                          <w:sz w:val="32"/>
+                          <w:szCs w:val="32"/>
                         </w:rPr>
                         <m:t>R1</m:t>
                       </m:r>
@@ -2787,6 +2861,8 @@
                       <m:ctrlPr>
                         <w:rPr>
                           <w:rFonts w:ascii="Cambria Math" w:hAnsi="Cambria Math"/>
+                          <w:sz w:val="32"/>
+                          <w:szCs w:val="32"/>
                         </w:rPr>
                       </m:ctrlPr>
                     </m:dPr>
@@ -2794,6 +2870,8 @@
                       <m:r>
                         <w:rPr>
                           <w:rFonts w:ascii="Cambria Math" w:hAnsi="Cambria Math"/>
+                          <w:sz w:val="32"/>
+                          <w:szCs w:val="32"/>
                         </w:rPr>
                         <m:t>t</m:t>
                       </m:r>
@@ -2802,6 +2880,8 @@
                   <m:r>
                     <w:rPr>
                       <w:rFonts w:ascii="Cambria Math" w:hAnsi="Cambria Math"/>
+                      <w:sz w:val="32"/>
+                      <w:szCs w:val="32"/>
                     </w:rPr>
                     <m:t>,</m:t>
                   </m:r>
@@ -2810,6 +2890,8 @@
                       <m:ctrlPr>
                         <w:rPr>
                           <w:rFonts w:ascii="Cambria Math" w:hAnsi="Cambria Math"/>
+                          <w:sz w:val="32"/>
+                          <w:szCs w:val="32"/>
                         </w:rPr>
                       </m:ctrlPr>
                     </m:sSubPr>
@@ -2817,6 +2899,8 @@
                       <m:r>
                         <w:rPr>
                           <w:rFonts w:ascii="Cambria Math" w:hAnsi="Cambria Math"/>
+                          <w:sz w:val="32"/>
+                          <w:szCs w:val="32"/>
                         </w:rPr>
                         <m:t>μ</m:t>
                       </m:r>
@@ -2825,6 +2909,8 @@
                       <m:r>
                         <w:rPr>
                           <w:rFonts w:ascii="Cambria Math" w:hAnsi="Cambria Math"/>
+                          <w:sz w:val="32"/>
+                          <w:szCs w:val="32"/>
                         </w:rPr>
                         <m:t>R2</m:t>
                       </m:r>
@@ -2835,6 +2921,8 @@
                       <m:ctrlPr>
                         <w:rPr>
                           <w:rFonts w:ascii="Cambria Math" w:hAnsi="Cambria Math"/>
+                          <w:sz w:val="32"/>
+                          <w:szCs w:val="32"/>
                         </w:rPr>
                       </m:ctrlPr>
                     </m:dPr>
@@ -2842,6 +2930,8 @@
                       <m:r>
                         <w:rPr>
                           <w:rFonts w:ascii="Cambria Math" w:hAnsi="Cambria Math"/>
+                          <w:sz w:val="32"/>
+                          <w:szCs w:val="32"/>
                         </w:rPr>
                         <m:t>t</m:t>
                       </m:r>
@@ -2850,6 +2940,8 @@
                   <m:r>
                     <w:rPr>
                       <w:rFonts w:ascii="Cambria Math" w:hAnsi="Cambria Math"/>
+                      <w:sz w:val="32"/>
+                      <w:szCs w:val="32"/>
                     </w:rPr>
                     <m:t>,…,</m:t>
                   </m:r>
@@ -2858,6 +2950,8 @@
                       <m:ctrlPr>
                         <w:rPr>
                           <w:rFonts w:ascii="Cambria Math" w:hAnsi="Cambria Math"/>
+                          <w:sz w:val="32"/>
+                          <w:szCs w:val="32"/>
                         </w:rPr>
                       </m:ctrlPr>
                     </m:sSubPr>
@@ -2865,6 +2959,8 @@
                       <m:r>
                         <w:rPr>
                           <w:rFonts w:ascii="Cambria Math" w:hAnsi="Cambria Math"/>
+                          <w:sz w:val="32"/>
+                          <w:szCs w:val="32"/>
                         </w:rPr>
                         <m:t>μ</m:t>
                       </m:r>
@@ -2873,6 +2969,8 @@
                       <m:r>
                         <w:rPr>
                           <w:rFonts w:ascii="Cambria Math" w:hAnsi="Cambria Math"/>
+                          <w:sz w:val="32"/>
+                          <w:szCs w:val="32"/>
                         </w:rPr>
                         <m:t>Rn</m:t>
                       </m:r>
@@ -2883,6 +2981,8 @@
                       <m:ctrlPr>
                         <w:rPr>
                           <w:rFonts w:ascii="Cambria Math" w:hAnsi="Cambria Math"/>
+                          <w:sz w:val="32"/>
+                          <w:szCs w:val="32"/>
                         </w:rPr>
                       </m:ctrlPr>
                     </m:dPr>
@@ -2890,6 +2990,8 @@
                       <m:r>
                         <w:rPr>
                           <w:rFonts w:ascii="Cambria Math" w:hAnsi="Cambria Math"/>
+                          <w:sz w:val="32"/>
+                          <w:szCs w:val="32"/>
                         </w:rPr>
                         <m:t>t</m:t>
                       </m:r>
@@ -2898,6 +3000,8 @@
                   <m:r>
                     <w:rPr>
                       <w:rFonts w:ascii="Cambria Math" w:hAnsi="Cambria Math"/>
+                      <w:sz w:val="32"/>
+                      <w:szCs w:val="32"/>
                     </w:rPr>
                     <m:t>)</m:t>
                   </m:r>
@@ -2920,6 +3024,8 @@
               <m:ctrlPr>
                 <w:rPr>
                   <w:rFonts w:ascii="Cambria Math" w:hAnsi="Cambria Math"/>
+                  <w:sz w:val="32"/>
+                  <w:szCs w:val="32"/>
                 </w:rPr>
               </m:ctrlPr>
             </m:sSupPr>
@@ -2927,6 +3033,8 @@
               <m:r>
                 <w:rPr>
                   <w:rFonts w:ascii="Cambria Math" w:hAnsi="Cambria Math"/>
+                  <w:sz w:val="32"/>
+                  <w:szCs w:val="32"/>
                 </w:rPr>
                 <m:t>Z</m:t>
               </m:r>
@@ -2935,6 +3043,8 @@
               <m:r>
                 <w:rPr>
                   <w:rFonts w:ascii="Cambria Math" w:hAnsi="Cambria Math"/>
+                  <w:sz w:val="32"/>
+                  <w:szCs w:val="32"/>
                 </w:rPr>
                 <m:t>*</m:t>
               </m:r>
@@ -2943,6 +3053,8 @@
           <m:r>
             <w:rPr>
               <w:rFonts w:ascii="Cambria Math" w:hAnsi="Cambria Math"/>
+              <w:sz w:val="32"/>
+              <w:szCs w:val="32"/>
             </w:rPr>
             <m:t>=</m:t>
           </m:r>
@@ -2951,6 +3063,8 @@
               <m:ctrlPr>
                 <w:rPr>
                   <w:rFonts w:ascii="Cambria Math" w:hAnsi="Cambria Math"/>
+                  <w:sz w:val="32"/>
+                  <w:szCs w:val="32"/>
                 </w:rPr>
               </m:ctrlPr>
             </m:fPr>
@@ -2963,6 +3077,8 @@
                   <m:ctrlPr>
                     <w:rPr>
                       <w:rFonts w:ascii="Cambria Math" w:hAnsi="Cambria Math"/>
+                      <w:sz w:val="32"/>
+                      <w:szCs w:val="32"/>
                     </w:rPr>
                   </m:ctrlPr>
                 </m:naryPr>
@@ -2972,6 +3088,8 @@
                   <m:r>
                     <w:rPr>
                       <w:rFonts w:ascii="Cambria Math" w:hAnsi="Cambria Math"/>
+                      <w:sz w:val="32"/>
+                      <w:szCs w:val="32"/>
                     </w:rPr>
                     <m:t>t</m:t>
                   </m:r>
@@ -2982,6 +3100,8 @@
                   <m:ctrlPr>
                     <w:rPr>
                       <w:rFonts w:ascii="Cambria Math" w:hAnsi="Cambria Math"/>
+                      <w:sz w:val="32"/>
+                      <w:szCs w:val="32"/>
                     </w:rPr>
                   </m:ctrlPr>
                 </m:sSubPr>
@@ -2989,6 +3109,8 @@
                   <m:r>
                     <w:rPr>
                       <w:rFonts w:ascii="Cambria Math" w:hAnsi="Cambria Math"/>
+                      <w:sz w:val="32"/>
+                      <w:szCs w:val="32"/>
                     </w:rPr>
                     <m:t>μ</m:t>
                   </m:r>
@@ -2997,6 +3119,8 @@
                   <m:r>
                     <w:rPr>
                       <w:rFonts w:ascii="Cambria Math" w:hAnsi="Cambria Math"/>
+                      <w:sz w:val="32"/>
+                      <w:szCs w:val="32"/>
                     </w:rPr>
                     <m:t>output</m:t>
                   </m:r>
@@ -3007,6 +3131,8 @@
                   <m:ctrlPr>
                     <w:rPr>
                       <w:rFonts w:ascii="Cambria Math" w:hAnsi="Cambria Math"/>
+                      <w:sz w:val="32"/>
+                      <w:szCs w:val="32"/>
                     </w:rPr>
                   </m:ctrlPr>
                 </m:dPr>
@@ -3014,6 +3140,8 @@
                   <m:r>
                     <w:rPr>
                       <w:rFonts w:ascii="Cambria Math" w:hAnsi="Cambria Math"/>
+                      <w:sz w:val="32"/>
+                      <w:szCs w:val="32"/>
                     </w:rPr>
                     <m:t>t</m:t>
                   </m:r>
@@ -3022,6 +3150,8 @@
               <m:r>
                 <w:rPr>
                   <w:rFonts w:ascii="Cambria Math" w:hAnsi="Cambria Math"/>
+                  <w:sz w:val="32"/>
+                  <w:szCs w:val="32"/>
                 </w:rPr>
                 <m:t> dt</m:t>
               </m:r>
@@ -3035,6 +3165,8 @@
                   <m:ctrlPr>
                     <w:rPr>
                       <w:rFonts w:ascii="Cambria Math" w:hAnsi="Cambria Math"/>
+                      <w:sz w:val="32"/>
+                      <w:szCs w:val="32"/>
                     </w:rPr>
                   </m:ctrlPr>
                 </m:naryPr>
@@ -3046,6 +3178,8 @@
                       <m:ctrlPr>
                         <w:rPr>
                           <w:rFonts w:ascii="Cambria Math" w:hAnsi="Cambria Math"/>
+                          <w:sz w:val="32"/>
+                          <w:szCs w:val="32"/>
                         </w:rPr>
                       </m:ctrlPr>
                     </m:sSubPr>
@@ -3053,6 +3187,8 @@
                       <m:r>
                         <w:rPr>
                           <w:rFonts w:ascii="Cambria Math" w:hAnsi="Cambria Math"/>
+                          <w:sz w:val="32"/>
+                          <w:szCs w:val="32"/>
                         </w:rPr>
                         <m:t>μ</m:t>
                       </m:r>
@@ -3061,6 +3197,8 @@
                       <m:r>
                         <w:rPr>
                           <w:rFonts w:ascii="Cambria Math" w:hAnsi="Cambria Math"/>
+                          <w:sz w:val="32"/>
+                          <w:szCs w:val="32"/>
                         </w:rPr>
                         <m:t>output</m:t>
                       </m:r>
@@ -3073,6 +3211,8 @@
                   <m:ctrlPr>
                     <w:rPr>
                       <w:rFonts w:ascii="Cambria Math" w:hAnsi="Cambria Math"/>
+                      <w:sz w:val="32"/>
+                      <w:szCs w:val="32"/>
                     </w:rPr>
                   </m:ctrlPr>
                 </m:dPr>
@@ -3080,6 +3220,8 @@
                   <m:r>
                     <w:rPr>
                       <w:rFonts w:ascii="Cambria Math" w:hAnsi="Cambria Math"/>
+                      <w:sz w:val="32"/>
+                      <w:szCs w:val="32"/>
                     </w:rPr>
                     <m:t>t</m:t>
                   </m:r>
@@ -3088,6 +3230,8 @@
               <m:r>
                 <w:rPr>
                   <w:rFonts w:ascii="Cambria Math" w:hAnsi="Cambria Math"/>
+                  <w:sz w:val="32"/>
+                  <w:szCs w:val="32"/>
                 </w:rPr>
                 <m:t> dt</m:t>
               </m:r>
@@ -3098,6 +3242,111 @@
     </w:p>
     <w:p>
       <w:pPr>
+        <w:spacing w:after="0"/>
+        <w:jc w:val="both"/>
+      </w:pPr>
+      <w:r>
+        <w:t>Keterangan:</w:t>
+      </w:r>
+    </w:p>
+    <w:p>
+      <w:pPr>
+        <w:numPr>
+          <w:ilvl w:val="0"/>
+          <w:numId w:val="1"/>
+        </w:numPr>
+        <w:spacing w:after="0"/>
+      </w:pPr>
+      <w:r>
+        <w:t>alpha_i = nilai predikat aturan fuzzy ke-i.</w:t>
+      </w:r>
+    </w:p>
+    <w:p>
+      <w:pPr>
+        <w:numPr>
+          <w:ilvl w:val="0"/>
+          <w:numId w:val="1"/>
+        </w:numPr>
+        <w:spacing w:after="0"/>
+      </w:pPr>
+      <w:r>
+        <w:t>mu_A(x), mu_B(y), dan mu_C(z) = derajat keanggotaan masing-masing input pada himpunan fuzzy yang digunakan.</w:t>
+      </w:r>
+    </w:p>
+    <w:p>
+      <w:pPr>
+        <w:numPr>
+          <w:ilvl w:val="0"/>
+          <w:numId w:val="1"/>
+        </w:numPr>
+        <w:spacing w:after="0"/>
+      </w:pPr>
+      <w:r>
+        <w:t>min = operator AND pada metode Mamdani, yaitu mengambil nilai derajat keanggotaan paling kecil.</w:t>
+      </w:r>
+    </w:p>
+    <w:p>
+      <w:pPr>
+        <w:numPr>
+          <w:ilvl w:val="0"/>
+          <w:numId w:val="1"/>
+        </w:numPr>
+        <w:spacing w:after="0"/>
+      </w:pPr>
+      <w:r>
+        <w:t>mu_output(t) = derajat keanggotaan gabungan pada variabel output setelah semua aturan dievaluasi.</w:t>
+      </w:r>
+    </w:p>
+    <w:p>
+      <w:pPr>
+        <w:numPr>
+          <w:ilvl w:val="0"/>
+          <w:numId w:val="1"/>
+        </w:numPr>
+        <w:spacing w:after="0"/>
+      </w:pPr>
+      <w:r>
+        <w:t>max = operator komposisi aturan, yaitu mengambil nilai terbesar dari keluaran aturan yang menuju himpunan output yang sama.</w:t>
+      </w:r>
+    </w:p>
+    <w:p>
+      <w:pPr>
+        <w:numPr>
+          <w:ilvl w:val="0"/>
+          <w:numId w:val="1"/>
+        </w:numPr>
+        <w:spacing w:after="0"/>
+      </w:pPr>
+      <w:r>
+        <w:t>Z* = nilai akhir hasil defuzzifikasi centroid.</w:t>
+      </w:r>
+    </w:p>
+    <w:p>
+      <w:pPr>
+        <w:numPr>
+          <w:ilvl w:val="0"/>
+          <w:numId w:val="1"/>
+        </w:numPr>
+        <w:spacing w:after="0"/>
+      </w:pPr>
+      <w:r>
+        <w:t>t = nilai pada domain output harga jual.</w:t>
+      </w:r>
+    </w:p>
+    <w:p>
+      <w:pPr>
+        <w:numPr>
+          <w:ilvl w:val="0"/>
+          <w:numId w:val="1"/>
+        </w:numPr>
+        <w:spacing w:after="0"/>
+      </w:pPr>
+      <w:r>
+        <w:t>Integral pada rumus centroid digunakan untuk mencari titik pusat dari daerah fuzzy hasil komposisi aturan.</w:t>
+      </w:r>
+    </w:p>
+    <w:p>
+      <w:pPr>
         <w:pStyle w:val="Heading1"/>
         <w:jc w:val="center"/>
         <w:rPr>
@@ -3750,12 +3999,6 @@
     </w:p>
     <w:tbl>
       <w:tblPr>
-        <w:tblCellMar>
-          <w:top w:w="120" w:type="dxa"/>
-          <w:left w:w="120" w:type="dxa"/>
-          <w:bottom w:w="120" w:type="dxa"/>
-          <w:right w:w="120" w:type="dxa"/>
-        </w:tblCellMar>
         <w:tblW w:w="5000" w:type="pct"/>
         <w:jc w:val="center"/>
         <w:tblBorders>
@@ -3766,14 +4009,20 @@
           <w:insideH w:val="single" w:sz="6" w:space="0" w:color="808080"/>
           <w:insideV w:val="single" w:sz="6" w:space="0" w:color="808080"/>
         </w:tblBorders>
+        <w:tblCellMar>
+          <w:top w:w="120" w:type="dxa"/>
+          <w:left w:w="120" w:type="dxa"/>
+          <w:bottom w:w="120" w:type="dxa"/>
+          <w:right w:w="120" w:type="dxa"/>
+        </w:tblCellMar>
         <w:tblLook w:val="04A0" w:firstRow="1" w:lastRow="0" w:firstColumn="1" w:lastColumn="0" w:noHBand="0" w:noVBand="1"/>
       </w:tblPr>
       <w:tblGrid>
-        <w:gridCol w:w="1916"/>
-        <w:gridCol w:w="1915"/>
-        <w:gridCol w:w="1915"/>
-        <w:gridCol w:w="1915"/>
-        <w:gridCol w:w="1915"/>
+        <w:gridCol w:w="1920"/>
+        <w:gridCol w:w="1920"/>
+        <w:gridCol w:w="1920"/>
+        <w:gridCol w:w="1920"/>
+        <w:gridCol w:w="1920"/>
       </w:tblGrid>
       <w:tr>
         <w:trPr>
@@ -3796,6 +4045,7 @@
               <w:rPr>
                 <w:b/>
               </w:rPr>
+              <w:lastRenderedPageBreak/>
               <w:t>Fungsi</w:t>
             </w:r>
             <w:proofErr w:type="spellEnd"/>
@@ -4871,7 +5121,6 @@
           <w:rFonts w:ascii="Times New Roman" w:eastAsia="Times New Roman" w:hAnsi="Times New Roman"/>
           <w:color w:val="auto"/>
         </w:rPr>
-        <w:lastRenderedPageBreak/>
         <w:t xml:space="preserve">3.2 </w:t>
       </w:r>
       <w:proofErr w:type="spellStart"/>
@@ -4995,12 +5244,6 @@
     </w:p>
     <w:tbl>
       <w:tblPr>
-        <w:tblCellMar>
-          <w:top w:w="120" w:type="dxa"/>
-          <w:left w:w="120" w:type="dxa"/>
-          <w:bottom w:w="120" w:type="dxa"/>
-          <w:right w:w="120" w:type="dxa"/>
-        </w:tblCellMar>
         <w:tblW w:w="5000" w:type="pct"/>
         <w:jc w:val="center"/>
         <w:tblBorders>
@@ -5011,14 +5254,20 @@
           <w:insideH w:val="single" w:sz="6" w:space="0" w:color="808080"/>
           <w:insideV w:val="single" w:sz="6" w:space="0" w:color="808080"/>
         </w:tblBorders>
+        <w:tblCellMar>
+          <w:top w:w="120" w:type="dxa"/>
+          <w:left w:w="120" w:type="dxa"/>
+          <w:bottom w:w="120" w:type="dxa"/>
+          <w:right w:w="120" w:type="dxa"/>
+        </w:tblCellMar>
         <w:tblLook w:val="04A0" w:firstRow="1" w:lastRow="0" w:firstColumn="1" w:lastColumn="0" w:noHBand="0" w:noVBand="1"/>
       </w:tblPr>
       <w:tblGrid>
-        <w:gridCol w:w="1916"/>
-        <w:gridCol w:w="1915"/>
-        <w:gridCol w:w="1915"/>
-        <w:gridCol w:w="1915"/>
-        <w:gridCol w:w="1915"/>
+        <w:gridCol w:w="1920"/>
+        <w:gridCol w:w="1920"/>
+        <w:gridCol w:w="1920"/>
+        <w:gridCol w:w="1920"/>
+        <w:gridCol w:w="1920"/>
       </w:tblGrid>
       <w:tr>
         <w:trPr>
@@ -5548,6 +5797,7 @@
               <w:jc w:val="center"/>
             </w:pPr>
             <w:r>
+              <w:lastRenderedPageBreak/>
               <w:t>R6</w:t>
             </w:r>
           </w:p>
@@ -8624,12 +8874,6 @@
     </w:p>
     <w:tbl>
       <w:tblPr>
-        <w:tblCellMar>
-          <w:top w:w="120" w:type="dxa"/>
-          <w:left w:w="120" w:type="dxa"/>
-          <w:bottom w:w="120" w:type="dxa"/>
-          <w:right w:w="120" w:type="dxa"/>
-        </w:tblCellMar>
         <w:tblW w:w="0" w:type="auto"/>
         <w:jc w:val="center"/>
         <w:tblBorders>
@@ -8640,6 +8884,12 @@
           <w:insideH w:val="single" w:sz="6" w:space="0" w:color="808080"/>
           <w:insideV w:val="single" w:sz="6" w:space="0" w:color="808080"/>
         </w:tblBorders>
+        <w:tblCellMar>
+          <w:top w:w="120" w:type="dxa"/>
+          <w:left w:w="120" w:type="dxa"/>
+          <w:bottom w:w="120" w:type="dxa"/>
+          <w:right w:w="120" w:type="dxa"/>
+        </w:tblCellMar>
         <w:tblLook w:val="04A0" w:firstRow="1" w:lastRow="0" w:firstColumn="1" w:lastColumn="0" w:noHBand="0" w:noVBand="1"/>
       </w:tblPr>
       <w:tblGrid>
@@ -9071,12 +9321,6 @@
     </w:p>
     <w:tbl>
       <w:tblPr>
-        <w:tblCellMar>
-          <w:top w:w="120" w:type="dxa"/>
-          <w:left w:w="120" w:type="dxa"/>
-          <w:bottom w:w="120" w:type="dxa"/>
-          <w:right w:w="120" w:type="dxa"/>
-        </w:tblCellMar>
         <w:tblW w:w="0" w:type="auto"/>
         <w:jc w:val="center"/>
         <w:tblBorders>
@@ -9087,6 +9331,12 @@
           <w:insideH w:val="single" w:sz="6" w:space="0" w:color="808080"/>
           <w:insideV w:val="single" w:sz="6" w:space="0" w:color="808080"/>
         </w:tblBorders>
+        <w:tblCellMar>
+          <w:top w:w="120" w:type="dxa"/>
+          <w:left w:w="120" w:type="dxa"/>
+          <w:bottom w:w="120" w:type="dxa"/>
+          <w:right w:w="120" w:type="dxa"/>
+        </w:tblCellMar>
         <w:tblLook w:val="04A0" w:firstRow="1" w:lastRow="0" w:firstColumn="1" w:lastColumn="0" w:noHBand="0" w:noVBand="1"/>
       </w:tblPr>
       <w:tblGrid>
@@ -9208,7 +9458,15 @@
             </w:r>
             <w:proofErr w:type="spellEnd"/>
             <w:r>
-              <w:t xml:space="preserve"> KURANG maka Harga </w:t>
+              <w:t xml:space="preserve"> KURANG </w:t>
+            </w:r>
+            <w:proofErr w:type="spellStart"/>
+            <w:r>
+              <w:t>maka</w:t>
+            </w:r>
+            <w:proofErr w:type="spellEnd"/>
+            <w:r>
+              <w:t xml:space="preserve"> Harga </w:t>
             </w:r>
             <w:proofErr w:type="spellStart"/>
             <w:r>
@@ -9251,6 +9509,7 @@
               <w:jc w:val="center"/>
             </w:pPr>
             <w:r>
+              <w:lastRenderedPageBreak/>
               <w:t>R2</w:t>
             </w:r>
           </w:p>
@@ -9273,19 +9532,23 @@
             </w:r>
             <w:proofErr w:type="spellEnd"/>
             <w:r>
-              <w:t xml:space="preserve"> RENDAH maka Harga </w:t>
+              <w:t xml:space="preserve"> RENDAH </w:t>
             </w:r>
             <w:proofErr w:type="spellStart"/>
             <w:r>
+              <w:t>maka</w:t>
+            </w:r>
+            <w:proofErr w:type="spellEnd"/>
+            <w:r>
+              <w:t xml:space="preserve"> Harga </w:t>
+            </w:r>
+            <w:proofErr w:type="spellStart"/>
+            <w:r>
               <w:t>jual</w:t>
             </w:r>
             <w:proofErr w:type="spellEnd"/>
             <w:r>
-              <w:t xml:space="preserve"> </w:t>
-            </w:r>
-            <w:r>
-              <w:lastRenderedPageBreak/>
-              <w:t>RENDAH</w:t>
+              <w:t xml:space="preserve"> RENDAH</w:t>
             </w:r>
           </w:p>
         </w:tc>
@@ -9300,7 +9563,6 @@
               <w:jc w:val="center"/>
             </w:pPr>
             <w:r>
-              <w:lastRenderedPageBreak/>
               <w:t>0</w:t>
             </w:r>
           </w:p>
@@ -10614,6 +10876,7 @@
           <w:rFonts w:ascii="Times New Roman" w:eastAsia="Times New Roman" w:hAnsi="Times New Roman"/>
           <w:color w:val="auto"/>
         </w:rPr>
+        <w:lastRenderedPageBreak/>
         <w:t xml:space="preserve">3.5 </w:t>
       </w:r>
       <w:proofErr w:type="spellStart"/>
@@ -10715,12 +10978,6 @@
     </w:p>
     <w:tbl>
       <w:tblPr>
-        <w:tblCellMar>
-          <w:top w:w="120" w:type="dxa"/>
-          <w:left w:w="120" w:type="dxa"/>
-          <w:bottom w:w="120" w:type="dxa"/>
-          <w:right w:w="120" w:type="dxa"/>
-        </w:tblCellMar>
         <w:tblW w:w="0" w:type="auto"/>
         <w:jc w:val="center"/>
         <w:tblBorders>
@@ -10731,11 +10988,17 @@
           <w:insideH w:val="single" w:sz="6" w:space="0" w:color="808080"/>
           <w:insideV w:val="single" w:sz="6" w:space="0" w:color="808080"/>
         </w:tblBorders>
+        <w:tblCellMar>
+          <w:top w:w="120" w:type="dxa"/>
+          <w:left w:w="120" w:type="dxa"/>
+          <w:bottom w:w="120" w:type="dxa"/>
+          <w:right w:w="120" w:type="dxa"/>
+        </w:tblCellMar>
         <w:tblLook w:val="04A0" w:firstRow="1" w:lastRow="0" w:firstColumn="1" w:lastColumn="0" w:noHBand="0" w:noVBand="1"/>
       </w:tblPr>
       <w:tblGrid>
-        <w:gridCol w:w="2340"/>
-        <w:gridCol w:w="2340"/>
+        <w:gridCol w:w="1620"/>
+        <w:gridCol w:w="3060"/>
         <w:gridCol w:w="2340"/>
         <w:gridCol w:w="2340"/>
       </w:tblGrid>
@@ -10745,7 +11008,7 @@
         </w:trPr>
         <w:tc>
           <w:tcPr>
-            <w:tcW w:w="2340" w:type="dxa"/>
+            <w:tcW w:w="1620" w:type="dxa"/>
             <w:shd w:val="clear" w:color="auto" w:fill="D9EAF7"/>
             <w:vAlign w:val="center"/>
           </w:tcPr>
@@ -10760,6 +11023,41 @@
                 <w:b/>
               </w:rPr>
               <w:t>Variabel</w:t>
+            </w:r>
+            <w:proofErr w:type="spellEnd"/>
+          </w:p>
+        </w:tc>
+        <w:tc>
+          <w:tcPr>
+            <w:tcW w:w="3060" w:type="dxa"/>
+            <w:shd w:val="clear" w:color="auto" w:fill="D9EAF7"/>
+            <w:vAlign w:val="center"/>
+          </w:tcPr>
+          <w:p>
+            <w:pPr>
+              <w:spacing w:after="0"/>
+              <w:jc w:val="center"/>
+            </w:pPr>
+            <w:proofErr w:type="spellStart"/>
+            <w:r>
+              <w:rPr>
+                <w:b/>
+              </w:rPr>
+              <w:t>Himpunan</w:t>
+            </w:r>
+            <w:proofErr w:type="spellEnd"/>
+            <w:r>
+              <w:rPr>
+                <w:b/>
+              </w:rPr>
+              <w:t xml:space="preserve"> </w:t>
+            </w:r>
+            <w:proofErr w:type="spellStart"/>
+            <w:r>
+              <w:rPr>
+                <w:b/>
+              </w:rPr>
+              <w:t>aktif</w:t>
             </w:r>
             <w:proofErr w:type="spellEnd"/>
           </w:p>
@@ -10780,21 +11078,7 @@
               <w:rPr>
                 <w:b/>
               </w:rPr>
-              <w:t>Himpunan</w:t>
-            </w:r>
-            <w:proofErr w:type="spellEnd"/>
-            <w:r>
-              <w:rPr>
-                <w:b/>
-              </w:rPr>
-              <w:t xml:space="preserve"> </w:t>
-            </w:r>
-            <w:proofErr w:type="spellStart"/>
-            <w:r>
-              <w:rPr>
-                <w:b/>
-              </w:rPr>
-              <w:t>aktif</w:t>
+              <w:t>Perhitungan</w:t>
             </w:r>
             <w:proofErr w:type="spellEnd"/>
           </w:p>
@@ -10810,27 +11094,6 @@
               <w:spacing w:after="0"/>
               <w:jc w:val="center"/>
             </w:pPr>
-            <w:proofErr w:type="spellStart"/>
-            <w:r>
-              <w:rPr>
-                <w:b/>
-              </w:rPr>
-              <w:t>Perhitungan</w:t>
-            </w:r>
-            <w:proofErr w:type="spellEnd"/>
-          </w:p>
-        </w:tc>
-        <w:tc>
-          <w:tcPr>
-            <w:tcW w:w="2340" w:type="dxa"/>
-            <w:shd w:val="clear" w:color="auto" w:fill="D9EAF7"/>
-            <w:vAlign w:val="center"/>
-          </w:tcPr>
-          <w:p>
-            <w:pPr>
-              <w:spacing w:after="0"/>
-              <w:jc w:val="center"/>
-            </w:pPr>
             <w:r>
               <w:t>Nilai mu</w:t>
             </w:r>
@@ -10843,7 +11106,7 @@
         </w:trPr>
         <w:tc>
           <w:tcPr>
-            <w:tcW w:w="2340" w:type="dxa"/>
+            <w:tcW w:w="1620" w:type="dxa"/>
             <w:vAlign w:val="center"/>
           </w:tcPr>
           <w:p>
@@ -10859,7 +11122,7 @@
         </w:tc>
         <w:tc>
           <w:tcPr>
-            <w:tcW w:w="2340" w:type="dxa"/>
+            <w:tcW w:w="3060" w:type="dxa"/>
             <w:vAlign w:val="center"/>
           </w:tcPr>
           <w:p>
@@ -10908,7 +11171,7 @@
         </w:trPr>
         <w:tc>
           <w:tcPr>
-            <w:tcW w:w="2340" w:type="dxa"/>
+            <w:tcW w:w="1620" w:type="dxa"/>
             <w:vAlign w:val="center"/>
           </w:tcPr>
           <w:p>
@@ -10916,7 +11179,6 @@
               <w:spacing w:after="0"/>
             </w:pPr>
             <w:r>
-              <w:lastRenderedPageBreak/>
               <w:t xml:space="preserve">Harga </w:t>
             </w:r>
             <w:proofErr w:type="spellStart"/>
@@ -10928,7 +11190,7 @@
         </w:tc>
         <w:tc>
           <w:tcPr>
-            <w:tcW w:w="2340" w:type="dxa"/>
+            <w:tcW w:w="3060" w:type="dxa"/>
             <w:vAlign w:val="center"/>
           </w:tcPr>
           <w:p>
@@ -10977,7 +11239,7 @@
         </w:trPr>
         <w:tc>
           <w:tcPr>
-            <w:tcW w:w="2340" w:type="dxa"/>
+            <w:tcW w:w="1620" w:type="dxa"/>
             <w:vAlign w:val="center"/>
           </w:tcPr>
           <w:p>
@@ -10996,7 +11258,7 @@
         </w:tc>
         <w:tc>
           <w:tcPr>
-            <w:tcW w:w="2340" w:type="dxa"/>
+            <w:tcW w:w="3060" w:type="dxa"/>
             <w:vAlign w:val="center"/>
           </w:tcPr>
           <w:p>
@@ -11044,7 +11306,7 @@
         </w:trPr>
         <w:tc>
           <w:tcPr>
-            <w:tcW w:w="2340" w:type="dxa"/>
+            <w:tcW w:w="1620" w:type="dxa"/>
             <w:vAlign w:val="center"/>
           </w:tcPr>
           <w:p>
@@ -11060,7 +11322,7 @@
         </w:tc>
         <w:tc>
           <w:tcPr>
-            <w:tcW w:w="2340" w:type="dxa"/>
+            <w:tcW w:w="3060" w:type="dxa"/>
             <w:vAlign w:val="center"/>
           </w:tcPr>
           <w:p>
@@ -11199,12 +11461,6 @@
     </w:p>
     <w:tbl>
       <w:tblPr>
-        <w:tblCellMar>
-          <w:top w:w="120" w:type="dxa"/>
-          <w:left w:w="120" w:type="dxa"/>
-          <w:bottom w:w="120" w:type="dxa"/>
-          <w:right w:w="120" w:type="dxa"/>
-        </w:tblCellMar>
         <w:tblW w:w="0" w:type="auto"/>
         <w:jc w:val="center"/>
         <w:tblBorders>
@@ -11215,12 +11471,18 @@
           <w:insideH w:val="single" w:sz="6" w:space="0" w:color="808080"/>
           <w:insideV w:val="single" w:sz="6" w:space="0" w:color="808080"/>
         </w:tblBorders>
+        <w:tblCellMar>
+          <w:top w:w="120" w:type="dxa"/>
+          <w:left w:w="120" w:type="dxa"/>
+          <w:bottom w:w="120" w:type="dxa"/>
+          <w:right w:w="120" w:type="dxa"/>
+        </w:tblCellMar>
         <w:tblLook w:val="04A0" w:firstRow="1" w:lastRow="0" w:firstColumn="1" w:lastColumn="0" w:noHBand="0" w:noVBand="1"/>
       </w:tblPr>
       <w:tblGrid>
-        <w:gridCol w:w="3120"/>
-        <w:gridCol w:w="3120"/>
-        <w:gridCol w:w="3120"/>
+        <w:gridCol w:w="1530"/>
+        <w:gridCol w:w="5670"/>
+        <w:gridCol w:w="2160"/>
       </w:tblGrid>
       <w:tr>
         <w:trPr>
@@ -11228,7 +11490,7 @@
         </w:trPr>
         <w:tc>
           <w:tcPr>
-            <w:tcW w:w="3120" w:type="dxa"/>
+            <w:tcW w:w="1530" w:type="dxa"/>
             <w:shd w:val="clear" w:color="auto" w:fill="D9EAF7"/>
             <w:vAlign w:val="center"/>
           </w:tcPr>
@@ -11247,7 +11509,7 @@
         </w:tc>
         <w:tc>
           <w:tcPr>
-            <w:tcW w:w="3120" w:type="dxa"/>
+            <w:tcW w:w="5670" w:type="dxa"/>
             <w:shd w:val="clear" w:color="auto" w:fill="D9EAF7"/>
             <w:vAlign w:val="center"/>
           </w:tcPr>
@@ -11282,7 +11544,7 @@
         </w:tc>
         <w:tc>
           <w:tcPr>
-            <w:tcW w:w="3120" w:type="dxa"/>
+            <w:tcW w:w="2160" w:type="dxa"/>
             <w:shd w:val="clear" w:color="auto" w:fill="D9EAF7"/>
             <w:vAlign w:val="center"/>
           </w:tcPr>
@@ -11308,7 +11570,7 @@
         </w:trPr>
         <w:tc>
           <w:tcPr>
-            <w:tcW w:w="3120" w:type="dxa"/>
+            <w:tcW w:w="1530" w:type="dxa"/>
             <w:vAlign w:val="center"/>
           </w:tcPr>
           <w:p>
@@ -11323,7 +11585,7 @@
         </w:tc>
         <w:tc>
           <w:tcPr>
-            <w:tcW w:w="3120" w:type="dxa"/>
+            <w:tcW w:w="5670" w:type="dxa"/>
             <w:vAlign w:val="center"/>
           </w:tcPr>
           <w:p>
@@ -11336,7 +11598,15 @@
             </w:r>
             <w:proofErr w:type="spellEnd"/>
             <w:r>
-              <w:t xml:space="preserve"> KURANG maka Harga </w:t>
+              <w:t xml:space="preserve"> KURANG </w:t>
+            </w:r>
+            <w:proofErr w:type="spellStart"/>
+            <w:r>
+              <w:t>maka</w:t>
+            </w:r>
+            <w:proofErr w:type="spellEnd"/>
+            <w:r>
+              <w:t xml:space="preserve"> Harga </w:t>
             </w:r>
             <w:proofErr w:type="spellStart"/>
             <w:r>
@@ -11350,7 +11620,7 @@
         </w:tc>
         <w:tc>
           <w:tcPr>
-            <w:tcW w:w="3120" w:type="dxa"/>
+            <w:tcW w:w="2160" w:type="dxa"/>
             <w:vAlign w:val="center"/>
           </w:tcPr>
           <w:p>
@@ -11370,7 +11640,7 @@
         </w:trPr>
         <w:tc>
           <w:tcPr>
-            <w:tcW w:w="3120" w:type="dxa"/>
+            <w:tcW w:w="1530" w:type="dxa"/>
             <w:vAlign w:val="center"/>
           </w:tcPr>
           <w:p>
@@ -11385,7 +11655,7 @@
         </w:tc>
         <w:tc>
           <w:tcPr>
-            <w:tcW w:w="3120" w:type="dxa"/>
+            <w:tcW w:w="5670" w:type="dxa"/>
             <w:vAlign w:val="center"/>
           </w:tcPr>
           <w:p>
@@ -11401,7 +11671,15 @@
             </w:r>
             <w:proofErr w:type="spellEnd"/>
             <w:r>
-              <w:t xml:space="preserve"> RENDAH maka Harga </w:t>
+              <w:t xml:space="preserve"> RENDAH </w:t>
+            </w:r>
+            <w:proofErr w:type="spellStart"/>
+            <w:r>
+              <w:t>maka</w:t>
+            </w:r>
+            <w:proofErr w:type="spellEnd"/>
+            <w:r>
+              <w:t xml:space="preserve"> Harga </w:t>
             </w:r>
             <w:proofErr w:type="spellStart"/>
             <w:r>
@@ -11415,7 +11693,7 @@
         </w:tc>
         <w:tc>
           <w:tcPr>
-            <w:tcW w:w="3120" w:type="dxa"/>
+            <w:tcW w:w="2160" w:type="dxa"/>
             <w:vAlign w:val="center"/>
           </w:tcPr>
           <w:p>
@@ -11435,7 +11713,7 @@
         </w:trPr>
         <w:tc>
           <w:tcPr>
-            <w:tcW w:w="3120" w:type="dxa"/>
+            <w:tcW w:w="1530" w:type="dxa"/>
             <w:vAlign w:val="center"/>
           </w:tcPr>
           <w:p>
@@ -11450,7 +11728,7 @@
         </w:tc>
         <w:tc>
           <w:tcPr>
-            <w:tcW w:w="3120" w:type="dxa"/>
+            <w:tcW w:w="5670" w:type="dxa"/>
             <w:vAlign w:val="center"/>
           </w:tcPr>
           <w:p>
@@ -11464,7 +11742,7 @@
         </w:tc>
         <w:tc>
           <w:tcPr>
-            <w:tcW w:w="3120" w:type="dxa"/>
+            <w:tcW w:w="2160" w:type="dxa"/>
             <w:vAlign w:val="center"/>
           </w:tcPr>
           <w:p>
@@ -11484,7 +11762,7 @@
         </w:trPr>
         <w:tc>
           <w:tcPr>
-            <w:tcW w:w="3120" w:type="dxa"/>
+            <w:tcW w:w="1530" w:type="dxa"/>
             <w:vAlign w:val="center"/>
           </w:tcPr>
           <w:p>
@@ -11499,7 +11777,7 @@
         </w:tc>
         <w:tc>
           <w:tcPr>
-            <w:tcW w:w="3120" w:type="dxa"/>
+            <w:tcW w:w="5670" w:type="dxa"/>
             <w:vAlign w:val="center"/>
           </w:tcPr>
           <w:p>
@@ -11513,7 +11791,7 @@
         </w:tc>
         <w:tc>
           <w:tcPr>
-            <w:tcW w:w="3120" w:type="dxa"/>
+            <w:tcW w:w="2160" w:type="dxa"/>
             <w:vAlign w:val="center"/>
           </w:tcPr>
           <w:p>
@@ -11533,7 +11811,7 @@
         </w:trPr>
         <w:tc>
           <w:tcPr>
-            <w:tcW w:w="3120" w:type="dxa"/>
+            <w:tcW w:w="1530" w:type="dxa"/>
             <w:vAlign w:val="center"/>
           </w:tcPr>
           <w:p>
@@ -11548,7 +11826,7 @@
         </w:tc>
         <w:tc>
           <w:tcPr>
-            <w:tcW w:w="3120" w:type="dxa"/>
+            <w:tcW w:w="5670" w:type="dxa"/>
             <w:vAlign w:val="center"/>
           </w:tcPr>
           <w:p>
@@ -11562,7 +11840,7 @@
         </w:tc>
         <w:tc>
           <w:tcPr>
-            <w:tcW w:w="3120" w:type="dxa"/>
+            <w:tcW w:w="2160" w:type="dxa"/>
             <w:vAlign w:val="center"/>
           </w:tcPr>
           <w:p>
@@ -11582,7 +11860,7 @@
         </w:trPr>
         <w:tc>
           <w:tcPr>
-            <w:tcW w:w="3120" w:type="dxa"/>
+            <w:tcW w:w="1530" w:type="dxa"/>
             <w:vAlign w:val="center"/>
           </w:tcPr>
           <w:p>
@@ -11597,7 +11875,7 @@
         </w:tc>
         <w:tc>
           <w:tcPr>
-            <w:tcW w:w="3120" w:type="dxa"/>
+            <w:tcW w:w="5670" w:type="dxa"/>
             <w:vAlign w:val="center"/>
           </w:tcPr>
           <w:p>
@@ -11611,7 +11889,7 @@
         </w:tc>
         <w:tc>
           <w:tcPr>
-            <w:tcW w:w="3120" w:type="dxa"/>
+            <w:tcW w:w="2160" w:type="dxa"/>
             <w:vAlign w:val="center"/>
           </w:tcPr>
           <w:p>
@@ -11631,7 +11909,7 @@
         </w:trPr>
         <w:tc>
           <w:tcPr>
-            <w:tcW w:w="3120" w:type="dxa"/>
+            <w:tcW w:w="1530" w:type="dxa"/>
             <w:vAlign w:val="center"/>
           </w:tcPr>
           <w:p>
@@ -11646,7 +11924,7 @@
         </w:tc>
         <w:tc>
           <w:tcPr>
-            <w:tcW w:w="3120" w:type="dxa"/>
+            <w:tcW w:w="5670" w:type="dxa"/>
             <w:vAlign w:val="center"/>
           </w:tcPr>
           <w:p>
@@ -11660,7 +11938,7 @@
         </w:tc>
         <w:tc>
           <w:tcPr>
-            <w:tcW w:w="3120" w:type="dxa"/>
+            <w:tcW w:w="2160" w:type="dxa"/>
             <w:vAlign w:val="center"/>
           </w:tcPr>
           <w:p>
@@ -11680,7 +11958,7 @@
         </w:trPr>
         <w:tc>
           <w:tcPr>
-            <w:tcW w:w="3120" w:type="dxa"/>
+            <w:tcW w:w="1530" w:type="dxa"/>
             <w:vAlign w:val="center"/>
           </w:tcPr>
           <w:p>
@@ -11695,7 +11973,7 @@
         </w:tc>
         <w:tc>
           <w:tcPr>
-            <w:tcW w:w="3120" w:type="dxa"/>
+            <w:tcW w:w="5670" w:type="dxa"/>
             <w:vAlign w:val="center"/>
           </w:tcPr>
           <w:p>
@@ -11709,7 +11987,7 @@
         </w:tc>
         <w:tc>
           <w:tcPr>
-            <w:tcW w:w="3120" w:type="dxa"/>
+            <w:tcW w:w="2160" w:type="dxa"/>
             <w:vAlign w:val="center"/>
           </w:tcPr>
           <w:p>
@@ -11729,7 +12007,7 @@
         </w:trPr>
         <w:tc>
           <w:tcPr>
-            <w:tcW w:w="3120" w:type="dxa"/>
+            <w:tcW w:w="1530" w:type="dxa"/>
             <w:vAlign w:val="center"/>
           </w:tcPr>
           <w:p>
@@ -11744,7 +12022,7 @@
         </w:tc>
         <w:tc>
           <w:tcPr>
-            <w:tcW w:w="3120" w:type="dxa"/>
+            <w:tcW w:w="5670" w:type="dxa"/>
             <w:vAlign w:val="center"/>
           </w:tcPr>
           <w:p>
@@ -11758,7 +12036,7 @@
         </w:tc>
         <w:tc>
           <w:tcPr>
-            <w:tcW w:w="3120" w:type="dxa"/>
+            <w:tcW w:w="2160" w:type="dxa"/>
             <w:vAlign w:val="center"/>
           </w:tcPr>
           <w:p>
@@ -11778,7 +12056,7 @@
         </w:trPr>
         <w:tc>
           <w:tcPr>
-            <w:tcW w:w="3120" w:type="dxa"/>
+            <w:tcW w:w="1530" w:type="dxa"/>
             <w:vAlign w:val="center"/>
           </w:tcPr>
           <w:p>
@@ -11787,13 +12065,14 @@
               <w:jc w:val="center"/>
             </w:pPr>
             <w:r>
+              <w:lastRenderedPageBreak/>
               <w:t>R10</w:t>
             </w:r>
           </w:p>
         </w:tc>
         <w:tc>
           <w:tcPr>
-            <w:tcW w:w="3120" w:type="dxa"/>
+            <w:tcW w:w="5670" w:type="dxa"/>
             <w:vAlign w:val="center"/>
           </w:tcPr>
           <w:p>
@@ -11807,7 +12086,7 @@
         </w:tc>
         <w:tc>
           <w:tcPr>
-            <w:tcW w:w="3120" w:type="dxa"/>
+            <w:tcW w:w="2160" w:type="dxa"/>
             <w:vAlign w:val="center"/>
           </w:tcPr>
           <w:p>
@@ -13027,12 +13306,6 @@
     </w:p>
     <w:tbl>
       <w:tblPr>
-        <w:tblCellMar>
-          <w:top w:w="120" w:type="dxa"/>
-          <w:left w:w="120" w:type="dxa"/>
-          <w:bottom w:w="120" w:type="dxa"/>
-          <w:right w:w="120" w:type="dxa"/>
-        </w:tblCellMar>
         <w:tblW w:w="0" w:type="auto"/>
         <w:jc w:val="center"/>
         <w:tblBorders>
@@ -13043,6 +13316,12 @@
           <w:insideH w:val="single" w:sz="6" w:space="0" w:color="808080"/>
           <w:insideV w:val="single" w:sz="6" w:space="0" w:color="808080"/>
         </w:tblBorders>
+        <w:tblCellMar>
+          <w:top w:w="120" w:type="dxa"/>
+          <w:left w:w="120" w:type="dxa"/>
+          <w:bottom w:w="120" w:type="dxa"/>
+          <w:right w:w="120" w:type="dxa"/>
+        </w:tblCellMar>
         <w:tblLook w:val="04A0" w:firstRow="1" w:lastRow="0" w:firstColumn="1" w:lastColumn="0" w:noHBand="0" w:noVBand="1"/>
       </w:tblPr>
       <w:tblGrid>
@@ -13604,6 +13883,7 @@
           <w:rFonts w:ascii="Times New Roman" w:eastAsia="Times New Roman" w:hAnsi="Times New Roman"/>
           <w:color w:val="auto"/>
         </w:rPr>
+        <w:lastRenderedPageBreak/>
         <w:t>BAB 4 KESIMPULAN</w:t>
       </w:r>
     </w:p>
@@ -14169,7 +14449,6 @@
     <w:lvl w:ilvl="0">
       <w:start w:val="1"/>
       <w:numFmt w:val="decimal"/>
-      <w:pStyle w:val="ListNumber3"/>
       <w:lvlText w:val="%1."/>
       <w:lvlJc w:val="left"/>
       <w:pPr>
@@ -14187,7 +14466,6 @@
     <w:lvl w:ilvl="0">
       <w:start w:val="1"/>
       <w:numFmt w:val="decimal"/>
-      <w:pStyle w:val="ListNumber2"/>
       <w:lvlText w:val="%1."/>
       <w:lvlJc w:val="left"/>
       <w:pPr>
@@ -14225,7 +14503,6 @@
     <w:lvl w:ilvl="0">
       <w:start w:val="1"/>
       <w:numFmt w:val="bullet"/>
-      <w:pStyle w:val="ListBullet3"/>
       <w:lvlText w:val=""/>
       <w:lvlJc w:val="left"/>
       <w:pPr>
@@ -14246,7 +14523,6 @@
     <w:lvl w:ilvl="0">
       <w:start w:val="1"/>
       <w:numFmt w:val="bullet"/>
-      <w:pStyle w:val="ListBullet2"/>
       <w:lvlText w:val=""/>
       <w:lvlJc w:val="left"/>
       <w:pPr>
@@ -14267,7 +14543,6 @@
     <w:lvl w:ilvl="0">
       <w:start w:val="1"/>
       <w:numFmt w:val="decimal"/>
-      <w:pStyle w:val="ListNumber"/>
       <w:lvlText w:val="%1."/>
       <w:lvlJc w:val="left"/>
       <w:pPr>
@@ -14285,7 +14560,6 @@
     <w:lvl w:ilvl="0">
       <w:start w:val="1"/>
       <w:numFmt w:val="bullet"/>
-      <w:pStyle w:val="ListBullet"/>
       <w:lvlText w:val=""/>
       <w:lvlJc w:val="left"/>
       <w:pPr>
@@ -14299,32 +14573,29 @@
       </w:rPr>
     </w:lvl>
   </w:abstractNum>
-  <w:num w:numId="1" w16cid:durableId="195896362">
-    <w:abstractNumId w:val="8"/>
-  </w:num>
-  <w:num w:numId="2" w16cid:durableId="1734886923">
-    <w:abstractNumId w:val="6"/>
-  </w:num>
-  <w:num w:numId="3" w16cid:durableId="1336036358">
-    <w:abstractNumId w:val="5"/>
-  </w:num>
-  <w:num w:numId="4" w16cid:durableId="1760634288">
-    <w:abstractNumId w:val="4"/>
-  </w:num>
-  <w:num w:numId="5" w16cid:durableId="1509753704">
-    <w:abstractNumId w:val="7"/>
-  </w:num>
-  <w:num w:numId="6" w16cid:durableId="880240891">
-    <w:abstractNumId w:val="3"/>
-  </w:num>
-  <w:num w:numId="7" w16cid:durableId="774636581">
-    <w:abstractNumId w:val="2"/>
-  </w:num>
-  <w:num w:numId="8" w16cid:durableId="1326128303">
-    <w:abstractNumId w:val="1"/>
-  </w:num>
-  <w:num w:numId="9" w16cid:durableId="1966154228">
-    <w:abstractNumId w:val="0"/>
+  <w:abstractNum w:abstractNumId="9" w15:restartNumberingAfterBreak="0">
+    <w:nsid w:val="5A7C2E10"/>
+    <w:multiLevelType w:val="singleLevel"/>
+    <w:tmpl w:val="04090001"/>
+    <w:lvl w:ilvl="0">
+      <w:start w:val="1"/>
+      <w:numFmt w:val="bullet"/>
+      <w:pStyle w:val="ListBullet"/>
+      <w:lvlText w:val=""/>
+      <w:lvlJc w:val="left"/>
+      <w:pPr>
+        <w:tabs>
+          <w:tab w:val="num" w:pos="720"/>
+        </w:tabs>
+        <w:ind w:left="720" w:hanging="360"/>
+      </w:pPr>
+      <w:rPr>
+        <w:rFonts w:ascii="Symbol" w:hAnsi="Symbol" w:hint="default"/>
+      </w:rPr>
+    </w:lvl>
+  </w:abstractNum>
+  <w:num w:numId="1" w16cid:durableId="1294873068">
+    <w:abstractNumId w:val="9"/>
   </w:num>
 </w:numbering>
 </file>
@@ -15254,9 +15525,9 @@
     <w:unhideWhenUsed/>
     <w:rsid w:val="00326F90"/>
     <w:pPr>
-      <w:numPr>
-        <w:numId w:val="2"/>
-      </w:numPr>
+      <w:tabs>
+        <w:tab w:val="num" w:pos="360"/>
+      </w:tabs>
       <w:contextualSpacing/>
     </w:pPr>
   </w:style>
@@ -15267,9 +15538,9 @@
     <w:unhideWhenUsed/>
     <w:rsid w:val="00326F90"/>
     <w:pPr>
-      <w:numPr>
-        <w:numId w:val="3"/>
-      </w:numPr>
+      <w:tabs>
+        <w:tab w:val="num" w:pos="360"/>
+      </w:tabs>
       <w:contextualSpacing/>
     </w:pPr>
   </w:style>
@@ -15280,9 +15551,9 @@
     <w:unhideWhenUsed/>
     <w:rsid w:val="00326F90"/>
     <w:pPr>
-      <w:numPr>
-        <w:numId w:val="5"/>
-      </w:numPr>
+      <w:tabs>
+        <w:tab w:val="num" w:pos="360"/>
+      </w:tabs>
       <w:contextualSpacing/>
     </w:pPr>
   </w:style>
@@ -15293,9 +15564,9 @@
     <w:unhideWhenUsed/>
     <w:rsid w:val="0029639D"/>
     <w:pPr>
-      <w:numPr>
-        <w:numId w:val="6"/>
-      </w:numPr>
+      <w:tabs>
+        <w:tab w:val="num" w:pos="360"/>
+      </w:tabs>
       <w:contextualSpacing/>
     </w:pPr>
   </w:style>
@@ -15306,9 +15577,9 @@
     <w:unhideWhenUsed/>
     <w:rsid w:val="0029639D"/>
     <w:pPr>
-      <w:numPr>
-        <w:numId w:val="7"/>
-      </w:numPr>
+      <w:tabs>
+        <w:tab w:val="num" w:pos="360"/>
+      </w:tabs>
       <w:contextualSpacing/>
     </w:pPr>
   </w:style>

</xml_diff>